<commit_message>
Avance en tarea de evidencias
Finalizacion de evidencias.
</commit_message>
<xml_diff>
--- a/control-despensa-api/Evidencias/Evidencias_API_Despensa_NombreApellido.docx
+++ b/control-despensa-api/Evidencias/Evidencias_API_Despensa_NombreApellido.docx
@@ -513,16 +513,7 @@
       <w:pPr>
         <w:pStyle w:val="Sinespaciado"/>
         <w:spacing w:after="0" w:line="240" w:lineRule="auto"/>
-        <w:jc w:val="both"/>
-        <w:rPr>
-          <w:b/>
-        </w:rPr>
-      </w:pPr>
-    </w:p>
-    <w:p>
-      <w:pPr>
-        <w:pStyle w:val="Sinespaciado"/>
-        <w:spacing w:after="0" w:line="240" w:lineRule="auto"/>
+        <w:ind w:left="0" w:firstLine="0"/>
         <w:jc w:val="both"/>
         <w:rPr>
           <w:b/>
@@ -660,6 +651,16 @@
           <w:b/>
         </w:rPr>
       </w:pPr>
+    </w:p>
+    <w:p>
+      <w:pPr>
+        <w:pStyle w:val="Sinespaciado"/>
+        <w:spacing w:after="0" w:line="240" w:lineRule="auto"/>
+        <w:jc w:val="both"/>
+        <w:rPr>
+          <w:b/>
+        </w:rPr>
+      </w:pPr>
       <w:r>
         <w:rPr>
           <w:b/>
@@ -682,9 +683,9 @@
           <w:b/>
         </w:rPr>
         <w:drawing>
-          <wp:inline distT="0" distB="0" distL="0" distR="0" wp14:anchorId="622CEEE5" wp14:editId="7B885D55">
-            <wp:extent cx="5612130" cy="1419860"/>
-            <wp:effectExtent l="0" t="0" r="7620" b="8890"/>
+          <wp:inline distT="0" distB="0" distL="0" distR="0" wp14:anchorId="622CEEE5" wp14:editId="35849C28">
+            <wp:extent cx="3519487" cy="1725784"/>
+            <wp:effectExtent l="0" t="0" r="5080" b="8255"/>
             <wp:docPr id="936586183" name="Imagen 1"/>
             <wp:cNvGraphicFramePr>
               <a:graphicFrameLocks xmlns:a="http://schemas.openxmlformats.org/drawingml/2006/main" noChangeAspect="1"/>
@@ -696,20 +697,29 @@
                     <pic:cNvPr id="936586183" name=""/>
                     <pic:cNvPicPr/>
                   </pic:nvPicPr>
-                  <pic:blipFill>
+                  <pic:blipFill rotWithShape="1">
                     <a:blip r:embed="rId12"/>
+                    <a:srcRect r="48405"/>
                     <a:stretch>
                       <a:fillRect/>
                     </a:stretch>
                   </pic:blipFill>
-                  <pic:spPr>
+                  <pic:spPr bwMode="auto">
                     <a:xfrm>
                       <a:off x="0" y="0"/>
-                      <a:ext cx="5612130" cy="1419860"/>
+                      <a:ext cx="3526443" cy="1729195"/>
                     </a:xfrm>
                     <a:prstGeom prst="rect">
                       <a:avLst/>
                     </a:prstGeom>
+                    <a:ln>
+                      <a:noFill/>
+                    </a:ln>
+                    <a:extLst>
+                      <a:ext uri="{53640926-AAD7-44D8-BBD7-CCE9431645EC}">
+                        <a14:shadowObscured xmlns:a14="http://schemas.microsoft.com/office/drawing/2010/main"/>
+                      </a:ext>
+                    </a:extLst>
                   </pic:spPr>
                 </pic:pic>
               </a:graphicData>
@@ -717,16 +727,6 @@
           </wp:inline>
         </w:drawing>
       </w:r>
-    </w:p>
-    <w:p>
-      <w:pPr>
-        <w:pStyle w:val="Sinespaciado"/>
-        <w:spacing w:after="0" w:line="240" w:lineRule="auto"/>
-        <w:jc w:val="both"/>
-        <w:rPr>
-          <w:b/>
-        </w:rPr>
-      </w:pPr>
     </w:p>
     <w:p>
       <w:pPr>
@@ -813,7 +813,7 @@
     <w:p>
       <w:pPr>
         <w:pStyle w:val="Sinespaciado"/>
-        <w:spacing w:after="0"/>
+        <w:spacing w:after="0" w:line="240" w:lineRule="auto"/>
         <w:jc w:val="both"/>
         <w:rPr>
           <w:b/>
@@ -864,6 +864,7 @@
       <w:pPr>
         <w:pStyle w:val="Sinespaciado"/>
         <w:spacing w:after="0" w:line="240" w:lineRule="auto"/>
+        <w:ind w:left="0" w:firstLine="0"/>
         <w:jc w:val="both"/>
         <w:rPr>
           <w:b/>
@@ -1051,7 +1052,7 @@
           <w:ilvl w:val="0"/>
           <w:numId w:val="15"/>
         </w:numPr>
-        <w:spacing w:after="0"/>
+        <w:spacing w:after="0" w:line="240" w:lineRule="auto"/>
         <w:jc w:val="both"/>
         <w:rPr>
           <w:b/>
@@ -1085,7 +1086,7 @@
     <w:p>
       <w:pPr>
         <w:pStyle w:val="Sinespaciado"/>
-        <w:spacing w:after="0"/>
+        <w:spacing w:after="0" w:line="240" w:lineRule="auto"/>
         <w:jc w:val="both"/>
         <w:rPr>
           <w:b/>
@@ -1100,7 +1101,7 @@
           <w:ilvl w:val="0"/>
           <w:numId w:val="15"/>
         </w:numPr>
-        <w:spacing w:after="0"/>
+        <w:spacing w:after="0" w:line="240" w:lineRule="auto"/>
         <w:jc w:val="both"/>
         <w:rPr>
           <w:b/>
@@ -1118,7 +1119,7 @@
     <w:p>
       <w:pPr>
         <w:pStyle w:val="Sinespaciado"/>
-        <w:spacing w:after="0"/>
+        <w:spacing w:after="0" w:line="240" w:lineRule="auto"/>
         <w:ind w:left="0" w:firstLine="0"/>
         <w:jc w:val="both"/>
         <w:rPr>
@@ -1126,6 +1127,47 @@
           <w:bCs w:val="0"/>
         </w:rPr>
       </w:pPr>
+      <w:r>
+        <w:rPr>
+          <w:b/>
+          <w:bCs w:val="0"/>
+        </w:rPr>
+        <w:drawing>
+          <wp:inline distT="0" distB="0" distL="0" distR="0" wp14:anchorId="1F90AFA1" wp14:editId="75814C5B">
+            <wp:extent cx="4763837" cy="4626927"/>
+            <wp:effectExtent l="0" t="0" r="0" b="2540"/>
+            <wp:docPr id="622786530" name="Imagen 1"/>
+            <wp:cNvGraphicFramePr>
+              <a:graphicFrameLocks xmlns:a="http://schemas.openxmlformats.org/drawingml/2006/main" noChangeAspect="1"/>
+            </wp:cNvGraphicFramePr>
+            <a:graphic xmlns:a="http://schemas.openxmlformats.org/drawingml/2006/main">
+              <a:graphicData uri="http://schemas.openxmlformats.org/drawingml/2006/picture">
+                <pic:pic xmlns:pic="http://schemas.openxmlformats.org/drawingml/2006/picture">
+                  <pic:nvPicPr>
+                    <pic:cNvPr id="622786530" name=""/>
+                    <pic:cNvPicPr/>
+                  </pic:nvPicPr>
+                  <pic:blipFill>
+                    <a:blip r:embed="rId16"/>
+                    <a:stretch>
+                      <a:fillRect/>
+                    </a:stretch>
+                  </pic:blipFill>
+                  <pic:spPr>
+                    <a:xfrm>
+                      <a:off x="0" y="0"/>
+                      <a:ext cx="4771935" cy="4634793"/>
+                    </a:xfrm>
+                    <a:prstGeom prst="rect">
+                      <a:avLst/>
+                    </a:prstGeom>
+                  </pic:spPr>
+                </pic:pic>
+              </a:graphicData>
+            </a:graphic>
+          </wp:inline>
+        </w:drawing>
+      </w:r>
     </w:p>
     <w:p>
       <w:pPr>
@@ -1134,7 +1176,7 @@
           <w:ilvl w:val="0"/>
           <w:numId w:val="15"/>
         </w:numPr>
-        <w:spacing w:after="0"/>
+        <w:spacing w:after="0" w:line="240" w:lineRule="auto"/>
         <w:jc w:val="both"/>
         <w:rPr>
           <w:b/>
@@ -1152,7 +1194,7 @@
     <w:p>
       <w:pPr>
         <w:pStyle w:val="Sinespaciado"/>
-        <w:spacing w:after="0"/>
+        <w:spacing w:after="0" w:line="240" w:lineRule="auto"/>
         <w:ind w:left="0" w:firstLine="0"/>
         <w:jc w:val="both"/>
         <w:rPr>
@@ -1160,6 +1202,101 @@
           <w:bCs w:val="0"/>
         </w:rPr>
       </w:pPr>
+      <w:r>
+        <w:rPr>
+          <w:b/>
+          <w:bCs w:val="0"/>
+        </w:rPr>
+        <w:drawing>
+          <wp:inline distT="0" distB="0" distL="0" distR="0" wp14:anchorId="3F62FC25" wp14:editId="13DF15F2">
+            <wp:extent cx="4738687" cy="1675537"/>
+            <wp:effectExtent l="0" t="0" r="5080" b="1270"/>
+            <wp:docPr id="1908164530" name="Imagen 1"/>
+            <wp:cNvGraphicFramePr>
+              <a:graphicFrameLocks xmlns:a="http://schemas.openxmlformats.org/drawingml/2006/main" noChangeAspect="1"/>
+            </wp:cNvGraphicFramePr>
+            <a:graphic xmlns:a="http://schemas.openxmlformats.org/drawingml/2006/main">
+              <a:graphicData uri="http://schemas.openxmlformats.org/drawingml/2006/picture">
+                <pic:pic xmlns:pic="http://schemas.openxmlformats.org/drawingml/2006/picture">
+                  <pic:nvPicPr>
+                    <pic:cNvPr id="1908164530" name=""/>
+                    <pic:cNvPicPr/>
+                  </pic:nvPicPr>
+                  <pic:blipFill>
+                    <a:blip r:embed="rId17"/>
+                    <a:stretch>
+                      <a:fillRect/>
+                    </a:stretch>
+                  </pic:blipFill>
+                  <pic:spPr>
+                    <a:xfrm>
+                      <a:off x="0" y="0"/>
+                      <a:ext cx="4754783" cy="1681228"/>
+                    </a:xfrm>
+                    <a:prstGeom prst="rect">
+                      <a:avLst/>
+                    </a:prstGeom>
+                  </pic:spPr>
+                </pic:pic>
+              </a:graphicData>
+            </a:graphic>
+          </wp:inline>
+        </w:drawing>
+      </w:r>
+    </w:p>
+    <w:p>
+      <w:pPr>
+        <w:pStyle w:val="Sinespaciado"/>
+        <w:spacing w:after="0" w:line="240" w:lineRule="auto"/>
+        <w:ind w:left="0" w:firstLine="0"/>
+        <w:jc w:val="both"/>
+        <w:rPr>
+          <w:b/>
+          <w:bCs w:val="0"/>
+        </w:rPr>
+      </w:pPr>
+      <w:r>
+        <w:rPr>
+          <w:b/>
+          <w:bCs w:val="0"/>
+        </w:rPr>
+        <w:lastRenderedPageBreak/>
+        <w:drawing>
+          <wp:inline distT="0" distB="0" distL="0" distR="0" wp14:anchorId="4286FA7C" wp14:editId="079545A8">
+            <wp:extent cx="4486275" cy="3574604"/>
+            <wp:effectExtent l="0" t="0" r="0" b="6985"/>
+            <wp:docPr id="422456811" name="Imagen 1"/>
+            <wp:cNvGraphicFramePr>
+              <a:graphicFrameLocks xmlns:a="http://schemas.openxmlformats.org/drawingml/2006/main" noChangeAspect="1"/>
+            </wp:cNvGraphicFramePr>
+            <a:graphic xmlns:a="http://schemas.openxmlformats.org/drawingml/2006/main">
+              <a:graphicData uri="http://schemas.openxmlformats.org/drawingml/2006/picture">
+                <pic:pic xmlns:pic="http://schemas.openxmlformats.org/drawingml/2006/picture">
+                  <pic:nvPicPr>
+                    <pic:cNvPr id="422456811" name=""/>
+                    <pic:cNvPicPr/>
+                  </pic:nvPicPr>
+                  <pic:blipFill>
+                    <a:blip r:embed="rId18"/>
+                    <a:stretch>
+                      <a:fillRect/>
+                    </a:stretch>
+                  </pic:blipFill>
+                  <pic:spPr>
+                    <a:xfrm>
+                      <a:off x="0" y="0"/>
+                      <a:ext cx="4491254" cy="3578571"/>
+                    </a:xfrm>
+                    <a:prstGeom prst="rect">
+                      <a:avLst/>
+                    </a:prstGeom>
+                  </pic:spPr>
+                </pic:pic>
+              </a:graphicData>
+            </a:graphic>
+          </wp:inline>
+        </w:drawing>
+      </w:r>
     </w:p>
     <w:p>
       <w:pPr>
@@ -1168,36 +1305,101 @@
           <w:ilvl w:val="0"/>
           <w:numId w:val="15"/>
         </w:numPr>
+        <w:spacing w:after="0" w:line="240" w:lineRule="auto"/>
+        <w:jc w:val="both"/>
+        <w:rPr>
+          <w:b/>
+          <w:bCs w:val="0"/>
+        </w:rPr>
+      </w:pPr>
+      <w:r>
+        <w:rPr>
+          <w:b/>
+          <w:bCs w:val="0"/>
+        </w:rPr>
+        <w:t xml:space="preserve">Captura de la clase </w:t>
+      </w:r>
+      <w:proofErr w:type="spellStart"/>
+      <w:r>
+        <w:rPr>
+          <w:b/>
+          <w:bCs w:val="0"/>
+        </w:rPr>
+        <w:t>ResumenInventario</w:t>
+      </w:r>
+      <w:proofErr w:type="spellEnd"/>
+      <w:r>
+        <w:rPr>
+          <w:b/>
+          <w:bCs w:val="0"/>
+        </w:rPr>
+        <w:t>.</w:t>
+      </w:r>
+    </w:p>
+    <w:p>
+      <w:pPr>
+        <w:pStyle w:val="Sinespaciado"/>
+        <w:spacing w:after="0" w:line="240" w:lineRule="auto"/>
+        <w:ind w:left="0" w:firstLine="0"/>
+        <w:jc w:val="both"/>
+        <w:rPr>
+          <w:b/>
+          <w:bCs w:val="0"/>
+        </w:rPr>
+      </w:pPr>
+      <w:r>
+        <w:rPr>
+          <w:b/>
+          <w:bCs w:val="0"/>
+        </w:rPr>
+        <w:drawing>
+          <wp:inline distT="0" distB="0" distL="0" distR="0" wp14:anchorId="5B39A037" wp14:editId="56222A21">
+            <wp:extent cx="4452937" cy="3705743"/>
+            <wp:effectExtent l="0" t="0" r="5080" b="9525"/>
+            <wp:docPr id="1620813576" name="Imagen 1"/>
+            <wp:cNvGraphicFramePr>
+              <a:graphicFrameLocks xmlns:a="http://schemas.openxmlformats.org/drawingml/2006/main" noChangeAspect="1"/>
+            </wp:cNvGraphicFramePr>
+            <a:graphic xmlns:a="http://schemas.openxmlformats.org/drawingml/2006/main">
+              <a:graphicData uri="http://schemas.openxmlformats.org/drawingml/2006/picture">
+                <pic:pic xmlns:pic="http://schemas.openxmlformats.org/drawingml/2006/picture">
+                  <pic:nvPicPr>
+                    <pic:cNvPr id="1620813576" name=""/>
+                    <pic:cNvPicPr/>
+                  </pic:nvPicPr>
+                  <pic:blipFill>
+                    <a:blip r:embed="rId19"/>
+                    <a:stretch>
+                      <a:fillRect/>
+                    </a:stretch>
+                  </pic:blipFill>
+                  <pic:spPr>
+                    <a:xfrm>
+                      <a:off x="0" y="0"/>
+                      <a:ext cx="4457569" cy="3709598"/>
+                    </a:xfrm>
+                    <a:prstGeom prst="rect">
+                      <a:avLst/>
+                    </a:prstGeom>
+                  </pic:spPr>
+                </pic:pic>
+              </a:graphicData>
+            </a:graphic>
+          </wp:inline>
+        </w:drawing>
+      </w:r>
+    </w:p>
+    <w:p>
+      <w:pPr>
+        <w:pStyle w:val="Sinespaciado"/>
         <w:spacing w:after="0"/>
-        <w:jc w:val="both"/>
-        <w:rPr>
-          <w:b/>
-          <w:bCs w:val="0"/>
-        </w:rPr>
-      </w:pPr>
-      <w:r>
-        <w:rPr>
-          <w:b/>
-          <w:bCs w:val="0"/>
-        </w:rPr>
-        <w:t xml:space="preserve">Captura de la clase </w:t>
-      </w:r>
-      <w:proofErr w:type="spellStart"/>
-      <w:r>
-        <w:rPr>
-          <w:b/>
-          <w:bCs w:val="0"/>
-        </w:rPr>
-        <w:t>ResumenInventario</w:t>
-      </w:r>
-      <w:proofErr w:type="spellEnd"/>
-      <w:r>
-        <w:rPr>
-          <w:b/>
-          <w:bCs w:val="0"/>
-        </w:rPr>
-        <w:t>.</w:t>
-      </w:r>
+        <w:ind w:left="0" w:firstLine="0"/>
+        <w:jc w:val="both"/>
+        <w:rPr>
+          <w:b/>
+          <w:bCs w:val="0"/>
+        </w:rPr>
+      </w:pPr>
     </w:p>
     <w:p>
       <w:pPr>
@@ -1218,25 +1420,26 @@
           <w:ilvl w:val="0"/>
           <w:numId w:val="15"/>
         </w:numPr>
-        <w:spacing w:after="0"/>
-        <w:jc w:val="both"/>
-        <w:rPr>
-          <w:b/>
-          <w:bCs w:val="0"/>
-        </w:rPr>
-      </w:pPr>
-      <w:r>
-        <w:rPr>
-          <w:b/>
-          <w:bCs w:val="0"/>
-        </w:rPr>
+        <w:spacing w:after="0" w:line="240" w:lineRule="auto"/>
+        <w:jc w:val="both"/>
+        <w:rPr>
+          <w:b/>
+          <w:bCs w:val="0"/>
+        </w:rPr>
+      </w:pPr>
+      <w:r>
+        <w:rPr>
+          <w:b/>
+          <w:bCs w:val="0"/>
+        </w:rPr>
+        <w:lastRenderedPageBreak/>
         <w:t>Captura del controlador.</w:t>
       </w:r>
     </w:p>
     <w:p>
       <w:pPr>
         <w:pStyle w:val="Sinespaciado"/>
-        <w:spacing w:after="0"/>
+        <w:spacing w:after="0" w:line="240" w:lineRule="auto"/>
         <w:ind w:left="0" w:firstLine="0"/>
         <w:jc w:val="both"/>
         <w:rPr>
@@ -1244,6 +1447,100 @@
           <w:bCs w:val="0"/>
         </w:rPr>
       </w:pPr>
+      <w:r>
+        <w:rPr>
+          <w:b/>
+          <w:bCs w:val="0"/>
+        </w:rPr>
+        <w:drawing>
+          <wp:inline distT="0" distB="0" distL="0" distR="0" wp14:anchorId="3BB3393E" wp14:editId="06803642">
+            <wp:extent cx="4495800" cy="1836878"/>
+            <wp:effectExtent l="0" t="0" r="0" b="0"/>
+            <wp:docPr id="1209816925" name="Imagen 1"/>
+            <wp:cNvGraphicFramePr>
+              <a:graphicFrameLocks xmlns:a="http://schemas.openxmlformats.org/drawingml/2006/main" noChangeAspect="1"/>
+            </wp:cNvGraphicFramePr>
+            <a:graphic xmlns:a="http://schemas.openxmlformats.org/drawingml/2006/main">
+              <a:graphicData uri="http://schemas.openxmlformats.org/drawingml/2006/picture">
+                <pic:pic xmlns:pic="http://schemas.openxmlformats.org/drawingml/2006/picture">
+                  <pic:nvPicPr>
+                    <pic:cNvPr id="1209816925" name=""/>
+                    <pic:cNvPicPr/>
+                  </pic:nvPicPr>
+                  <pic:blipFill>
+                    <a:blip r:embed="rId20"/>
+                    <a:stretch>
+                      <a:fillRect/>
+                    </a:stretch>
+                  </pic:blipFill>
+                  <pic:spPr>
+                    <a:xfrm>
+                      <a:off x="0" y="0"/>
+                      <a:ext cx="4531611" cy="1851510"/>
+                    </a:xfrm>
+                    <a:prstGeom prst="rect">
+                      <a:avLst/>
+                    </a:prstGeom>
+                  </pic:spPr>
+                </pic:pic>
+              </a:graphicData>
+            </a:graphic>
+          </wp:inline>
+        </w:drawing>
+      </w:r>
+    </w:p>
+    <w:p>
+      <w:pPr>
+        <w:pStyle w:val="Sinespaciado"/>
+        <w:spacing w:after="0" w:line="240" w:lineRule="auto"/>
+        <w:ind w:left="0" w:firstLine="0"/>
+        <w:jc w:val="both"/>
+        <w:rPr>
+          <w:b/>
+          <w:bCs w:val="0"/>
+        </w:rPr>
+      </w:pPr>
+      <w:r>
+        <w:rPr>
+          <w:b/>
+          <w:bCs w:val="0"/>
+        </w:rPr>
+        <w:drawing>
+          <wp:inline distT="0" distB="0" distL="0" distR="0" wp14:anchorId="5F4DABAE" wp14:editId="59C952F7">
+            <wp:extent cx="4496291" cy="3359753"/>
+            <wp:effectExtent l="0" t="0" r="0" b="0"/>
+            <wp:docPr id="1747717959" name="Imagen 1"/>
+            <wp:cNvGraphicFramePr>
+              <a:graphicFrameLocks xmlns:a="http://schemas.openxmlformats.org/drawingml/2006/main" noChangeAspect="1"/>
+            </wp:cNvGraphicFramePr>
+            <a:graphic xmlns:a="http://schemas.openxmlformats.org/drawingml/2006/main">
+              <a:graphicData uri="http://schemas.openxmlformats.org/drawingml/2006/picture">
+                <pic:pic xmlns:pic="http://schemas.openxmlformats.org/drawingml/2006/picture">
+                  <pic:nvPicPr>
+                    <pic:cNvPr id="1747717959" name=""/>
+                    <pic:cNvPicPr/>
+                  </pic:nvPicPr>
+                  <pic:blipFill>
+                    <a:blip r:embed="rId21"/>
+                    <a:stretch>
+                      <a:fillRect/>
+                    </a:stretch>
+                  </pic:blipFill>
+                  <pic:spPr>
+                    <a:xfrm>
+                      <a:off x="0" y="0"/>
+                      <a:ext cx="4511969" cy="3371468"/>
+                    </a:xfrm>
+                    <a:prstGeom prst="rect">
+                      <a:avLst/>
+                    </a:prstGeom>
+                  </pic:spPr>
+                </pic:pic>
+              </a:graphicData>
+            </a:graphic>
+          </wp:inline>
+        </w:drawing>
+      </w:r>
     </w:p>
     <w:p>
       <w:pPr>
@@ -1252,7 +1549,7 @@
           <w:ilvl w:val="0"/>
           <w:numId w:val="15"/>
         </w:numPr>
-        <w:spacing w:after="0"/>
+        <w:spacing w:after="0" w:line="240" w:lineRule="auto"/>
         <w:jc w:val="both"/>
         <w:rPr>
           <w:b/>
@@ -1265,6 +1562,59 @@
           <w:bCs w:val="0"/>
         </w:rPr>
         <w:t>Captura de la aplicación iniciada correctamente.</w:t>
+      </w:r>
+    </w:p>
+    <w:p>
+      <w:pPr>
+        <w:pStyle w:val="Sinespaciado"/>
+        <w:spacing w:after="0" w:line="240" w:lineRule="auto"/>
+        <w:ind w:left="0" w:firstLine="0"/>
+        <w:jc w:val="both"/>
+        <w:rPr>
+          <w:b/>
+          <w:bCs w:val="0"/>
+        </w:rPr>
+      </w:pPr>
+      <w:r>
+        <w:rPr>
+          <w:b/>
+          <w:bCs w:val="0"/>
+        </w:rPr>
+        <w:drawing>
+          <wp:inline distT="0" distB="0" distL="0" distR="0" wp14:anchorId="7781DC15" wp14:editId="7E3598D2">
+            <wp:extent cx="5972924" cy="2433638"/>
+            <wp:effectExtent l="0" t="0" r="0" b="5080"/>
+            <wp:docPr id="117888111" name="Imagen 1"/>
+            <wp:cNvGraphicFramePr>
+              <a:graphicFrameLocks xmlns:a="http://schemas.openxmlformats.org/drawingml/2006/main" noChangeAspect="1"/>
+            </wp:cNvGraphicFramePr>
+            <a:graphic xmlns:a="http://schemas.openxmlformats.org/drawingml/2006/main">
+              <a:graphicData uri="http://schemas.openxmlformats.org/drawingml/2006/picture">
+                <pic:pic xmlns:pic="http://schemas.openxmlformats.org/drawingml/2006/picture">
+                  <pic:nvPicPr>
+                    <pic:cNvPr id="117888111" name=""/>
+                    <pic:cNvPicPr/>
+                  </pic:nvPicPr>
+                  <pic:blipFill>
+                    <a:blip r:embed="rId22"/>
+                    <a:stretch>
+                      <a:fillRect/>
+                    </a:stretch>
+                  </pic:blipFill>
+                  <pic:spPr>
+                    <a:xfrm>
+                      <a:off x="0" y="0"/>
+                      <a:ext cx="5991530" cy="2441219"/>
+                    </a:xfrm>
+                    <a:prstGeom prst="rect">
+                      <a:avLst/>
+                    </a:prstGeom>
+                  </pic:spPr>
+                </pic:pic>
+              </a:graphicData>
+            </a:graphic>
+          </wp:inline>
+        </w:drawing>
       </w:r>
     </w:p>
     <w:p>
@@ -1286,25 +1636,26 @@
           <w:ilvl w:val="0"/>
           <w:numId w:val="15"/>
         </w:numPr>
-        <w:spacing w:after="0"/>
-        <w:jc w:val="both"/>
-        <w:rPr>
-          <w:b/>
-          <w:bCs w:val="0"/>
-        </w:rPr>
-      </w:pPr>
-      <w:r>
-        <w:rPr>
-          <w:b/>
-          <w:bCs w:val="0"/>
-        </w:rPr>
+        <w:spacing w:after="0" w:line="240" w:lineRule="auto"/>
+        <w:jc w:val="both"/>
+        <w:rPr>
+          <w:b/>
+          <w:bCs w:val="0"/>
+        </w:rPr>
+      </w:pPr>
+      <w:r>
+        <w:rPr>
+          <w:b/>
+          <w:bCs w:val="0"/>
+        </w:rPr>
+        <w:lastRenderedPageBreak/>
         <w:t>Captura de GET /api/productos.</w:t>
       </w:r>
     </w:p>
     <w:p>
       <w:pPr>
         <w:pStyle w:val="Sinespaciado"/>
-        <w:spacing w:after="0"/>
+        <w:spacing w:after="0" w:line="240" w:lineRule="auto"/>
         <w:ind w:left="0" w:firstLine="0"/>
         <w:jc w:val="both"/>
         <w:rPr>
@@ -1312,6 +1663,46 @@
           <w:bCs w:val="0"/>
         </w:rPr>
       </w:pPr>
+      <w:r>
+        <w:rPr>
+          <w:b/>
+        </w:rPr>
+        <w:drawing>
+          <wp:inline distT="0" distB="0" distL="0" distR="0" wp14:anchorId="11264783" wp14:editId="230CA5E3">
+            <wp:extent cx="5612130" cy="3000642"/>
+            <wp:effectExtent l="0" t="0" r="7620" b="9525"/>
+            <wp:docPr id="1567815247" name="Imagen 1"/>
+            <wp:cNvGraphicFramePr>
+              <a:graphicFrameLocks xmlns:a="http://schemas.openxmlformats.org/drawingml/2006/main" noChangeAspect="1"/>
+            </wp:cNvGraphicFramePr>
+            <a:graphic xmlns:a="http://schemas.openxmlformats.org/drawingml/2006/main">
+              <a:graphicData uri="http://schemas.openxmlformats.org/drawingml/2006/picture">
+                <pic:pic xmlns:pic="http://schemas.openxmlformats.org/drawingml/2006/picture">
+                  <pic:nvPicPr>
+                    <pic:cNvPr id="1651665670" name=""/>
+                    <pic:cNvPicPr/>
+                  </pic:nvPicPr>
+                  <pic:blipFill>
+                    <a:blip r:embed="rId9"/>
+                    <a:stretch>
+                      <a:fillRect/>
+                    </a:stretch>
+                  </pic:blipFill>
+                  <pic:spPr>
+                    <a:xfrm>
+                      <a:off x="0" y="0"/>
+                      <a:ext cx="5612130" cy="3000642"/>
+                    </a:xfrm>
+                    <a:prstGeom prst="rect">
+                      <a:avLst/>
+                    </a:prstGeom>
+                  </pic:spPr>
+                </pic:pic>
+              </a:graphicData>
+            </a:graphic>
+          </wp:inline>
+        </w:drawing>
+      </w:r>
     </w:p>
     <w:p>
       <w:pPr>
@@ -1320,7 +1711,7 @@
           <w:ilvl w:val="0"/>
           <w:numId w:val="15"/>
         </w:numPr>
-        <w:spacing w:after="0"/>
+        <w:spacing w:after="0" w:line="240" w:lineRule="auto"/>
         <w:jc w:val="both"/>
         <w:rPr>
           <w:b/>
@@ -1338,7 +1729,7 @@
     <w:p>
       <w:pPr>
         <w:pStyle w:val="Sinespaciado"/>
-        <w:spacing w:after="0"/>
+        <w:spacing w:after="0" w:line="240" w:lineRule="auto"/>
         <w:ind w:left="0" w:firstLine="0"/>
         <w:jc w:val="both"/>
         <w:rPr>
@@ -1346,6 +1737,46 @@
           <w:bCs w:val="0"/>
         </w:rPr>
       </w:pPr>
+      <w:r>
+        <w:rPr>
+          <w:b/>
+        </w:rPr>
+        <w:drawing>
+          <wp:inline distT="0" distB="0" distL="0" distR="0" wp14:anchorId="26BAD1C3" wp14:editId="5C5F55B9">
+            <wp:extent cx="5612130" cy="1756410"/>
+            <wp:effectExtent l="0" t="0" r="7620" b="0"/>
+            <wp:docPr id="1991428665" name="Imagen 1"/>
+            <wp:cNvGraphicFramePr>
+              <a:graphicFrameLocks xmlns:a="http://schemas.openxmlformats.org/drawingml/2006/main" noChangeAspect="1"/>
+            </wp:cNvGraphicFramePr>
+            <a:graphic xmlns:a="http://schemas.openxmlformats.org/drawingml/2006/main">
+              <a:graphicData uri="http://schemas.openxmlformats.org/drawingml/2006/picture">
+                <pic:pic xmlns:pic="http://schemas.openxmlformats.org/drawingml/2006/picture">
+                  <pic:nvPicPr>
+                    <pic:cNvPr id="814915641" name=""/>
+                    <pic:cNvPicPr/>
+                  </pic:nvPicPr>
+                  <pic:blipFill>
+                    <a:blip r:embed="rId10"/>
+                    <a:stretch>
+                      <a:fillRect/>
+                    </a:stretch>
+                  </pic:blipFill>
+                  <pic:spPr>
+                    <a:xfrm>
+                      <a:off x="0" y="0"/>
+                      <a:ext cx="5612130" cy="1756410"/>
+                    </a:xfrm>
+                    <a:prstGeom prst="rect">
+                      <a:avLst/>
+                    </a:prstGeom>
+                  </pic:spPr>
+                </pic:pic>
+              </a:graphicData>
+            </a:graphic>
+          </wp:inline>
+        </w:drawing>
+      </w:r>
     </w:p>
     <w:p>
       <w:pPr>
@@ -1354,7 +1785,7 @@
           <w:ilvl w:val="0"/>
           <w:numId w:val="15"/>
         </w:numPr>
-        <w:spacing w:after="0"/>
+        <w:spacing w:after="0" w:line="240" w:lineRule="auto"/>
         <w:jc w:val="both"/>
         <w:rPr>
           <w:b/>
@@ -1371,21 +1802,86 @@
     </w:p>
     <w:p>
       <w:pPr>
-        <w:pStyle w:val="Prrafodelista"/>
+        <w:spacing w:line="240" w:lineRule="auto"/>
         <w:rPr>
           <w:b/>
           <w:bCs/>
         </w:rPr>
       </w:pPr>
-    </w:p>
-    <w:p>
-      <w:pPr>
-        <w:pStyle w:val="Sinespaciado"/>
-        <w:spacing w:after="0"/>
-        <w:jc w:val="both"/>
-        <w:rPr>
-          <w:b/>
-          <w:bCs w:val="0"/>
+      <w:r>
+        <w:rPr>
+          <w:b/>
+        </w:rPr>
+        <w:drawing>
+          <wp:inline distT="0" distB="0" distL="0" distR="0" wp14:anchorId="2384502F" wp14:editId="2604F0DE">
+            <wp:extent cx="4943475" cy="1755779"/>
+            <wp:effectExtent l="0" t="0" r="0" b="0"/>
+            <wp:docPr id="1588423917" name="Imagen 1"/>
+            <wp:cNvGraphicFramePr>
+              <a:graphicFrameLocks xmlns:a="http://schemas.openxmlformats.org/drawingml/2006/main" noChangeAspect="1"/>
+            </wp:cNvGraphicFramePr>
+            <a:graphic xmlns:a="http://schemas.openxmlformats.org/drawingml/2006/main">
+              <a:graphicData uri="http://schemas.openxmlformats.org/drawingml/2006/picture">
+                <pic:pic xmlns:pic="http://schemas.openxmlformats.org/drawingml/2006/picture">
+                  <pic:nvPicPr>
+                    <pic:cNvPr id="1810321768" name=""/>
+                    <pic:cNvPicPr/>
+                  </pic:nvPicPr>
+                  <pic:blipFill>
+                    <a:blip r:embed="rId11"/>
+                    <a:stretch>
+                      <a:fillRect/>
+                    </a:stretch>
+                  </pic:blipFill>
+                  <pic:spPr>
+                    <a:xfrm>
+                      <a:off x="0" y="0"/>
+                      <a:ext cx="4957471" cy="1760750"/>
+                    </a:xfrm>
+                    <a:prstGeom prst="rect">
+                      <a:avLst/>
+                    </a:prstGeom>
+                  </pic:spPr>
+                </pic:pic>
+              </a:graphicData>
+            </a:graphic>
+          </wp:inline>
+        </w:drawing>
+      </w:r>
+    </w:p>
+    <w:p>
+      <w:pPr>
+        <w:spacing w:line="240" w:lineRule="auto"/>
+        <w:rPr>
+          <w:b/>
+          <w:bCs/>
+        </w:rPr>
+      </w:pPr>
+    </w:p>
+    <w:p>
+      <w:pPr>
+        <w:spacing w:line="240" w:lineRule="auto"/>
+        <w:rPr>
+          <w:b/>
+          <w:bCs/>
+        </w:rPr>
+      </w:pPr>
+    </w:p>
+    <w:p>
+      <w:pPr>
+        <w:spacing w:line="240" w:lineRule="auto"/>
+        <w:rPr>
+          <w:b/>
+          <w:bCs/>
+        </w:rPr>
+      </w:pPr>
+    </w:p>
+    <w:p>
+      <w:pPr>
+        <w:spacing w:line="240" w:lineRule="auto"/>
+        <w:rPr>
+          <w:b/>
+          <w:bCs/>
         </w:rPr>
       </w:pPr>
     </w:p>
@@ -1396,31 +1892,81 @@
           <w:ilvl w:val="0"/>
           <w:numId w:val="15"/>
         </w:numPr>
-        <w:spacing w:after="0"/>
-        <w:jc w:val="both"/>
-        <w:rPr>
-          <w:b/>
-          <w:bCs w:val="0"/>
-        </w:rPr>
-      </w:pPr>
-      <w:r>
-        <w:rPr>
-          <w:b/>
-          <w:bCs w:val="0"/>
-        </w:rPr>
+        <w:spacing w:after="0" w:line="240" w:lineRule="auto"/>
+        <w:jc w:val="both"/>
+        <w:rPr>
+          <w:b/>
+          <w:bCs w:val="0"/>
+        </w:rPr>
+      </w:pPr>
+      <w:r>
+        <w:rPr>
+          <w:b/>
+          <w:bCs w:val="0"/>
+        </w:rPr>
+        <w:lastRenderedPageBreak/>
         <w:t>Captura del filtro por categoría.</w:t>
       </w:r>
     </w:p>
     <w:p>
       <w:pPr>
         <w:pStyle w:val="Sinespaciado"/>
-        <w:spacing w:after="0"/>
-        <w:jc w:val="both"/>
-        <w:rPr>
-          <w:b/>
-          <w:bCs w:val="0"/>
-        </w:rPr>
-      </w:pPr>
+        <w:spacing w:after="0" w:line="240" w:lineRule="auto"/>
+        <w:jc w:val="both"/>
+        <w:rPr>
+          <w:b/>
+          <w:bCs w:val="0"/>
+        </w:rPr>
+      </w:pPr>
+      <w:r>
+        <w:rPr>
+          <w:b/>
+        </w:rPr>
+        <w:drawing>
+          <wp:inline distT="0" distB="0" distL="0" distR="0" wp14:anchorId="0A0F4790" wp14:editId="46A62225">
+            <wp:extent cx="5072062" cy="1655947"/>
+            <wp:effectExtent l="0" t="0" r="0" b="1905"/>
+            <wp:docPr id="1808897848" name="Imagen 1"/>
+            <wp:cNvGraphicFramePr>
+              <a:graphicFrameLocks xmlns:a="http://schemas.openxmlformats.org/drawingml/2006/main" noChangeAspect="1"/>
+            </wp:cNvGraphicFramePr>
+            <a:graphic xmlns:a="http://schemas.openxmlformats.org/drawingml/2006/main">
+              <a:graphicData uri="http://schemas.openxmlformats.org/drawingml/2006/picture">
+                <pic:pic xmlns:pic="http://schemas.openxmlformats.org/drawingml/2006/picture">
+                  <pic:nvPicPr>
+                    <pic:cNvPr id="936586183" name=""/>
+                    <pic:cNvPicPr/>
+                  </pic:nvPicPr>
+                  <pic:blipFill rotWithShape="1">
+                    <a:blip r:embed="rId12"/>
+                    <a:srcRect r="25662" b="4069"/>
+                    <a:stretch>
+                      <a:fillRect/>
+                    </a:stretch>
+                  </pic:blipFill>
+                  <pic:spPr bwMode="auto">
+                    <a:xfrm>
+                      <a:off x="0" y="0"/>
+                      <a:ext cx="5080261" cy="1658624"/>
+                    </a:xfrm>
+                    <a:prstGeom prst="rect">
+                      <a:avLst/>
+                    </a:prstGeom>
+                    <a:ln>
+                      <a:noFill/>
+                    </a:ln>
+                    <a:extLst>
+                      <a:ext uri="{53640926-AAD7-44D8-BBD7-CCE9431645EC}">
+                        <a14:shadowObscured xmlns:a14="http://schemas.microsoft.com/office/drawing/2010/main"/>
+                      </a:ext>
+                    </a:extLst>
+                  </pic:spPr>
+                </pic:pic>
+              </a:graphicData>
+            </a:graphic>
+          </wp:inline>
+        </w:drawing>
+      </w:r>
     </w:p>
     <w:p>
       <w:pPr>
@@ -1429,7 +1975,7 @@
           <w:ilvl w:val="0"/>
           <w:numId w:val="15"/>
         </w:numPr>
-        <w:spacing w:after="0"/>
+        <w:spacing w:after="0" w:line="240" w:lineRule="auto"/>
         <w:jc w:val="both"/>
         <w:rPr>
           <w:b/>
@@ -1463,7 +2009,7 @@
     <w:p>
       <w:pPr>
         <w:pStyle w:val="Sinespaciado"/>
-        <w:spacing w:after="0"/>
+        <w:spacing w:after="0" w:line="240" w:lineRule="auto"/>
         <w:ind w:left="0" w:firstLine="0"/>
         <w:jc w:val="both"/>
         <w:rPr>
@@ -1471,6 +2017,55 @@
           <w:bCs w:val="0"/>
         </w:rPr>
       </w:pPr>
+      <w:r>
+        <w:rPr>
+          <w:b/>
+        </w:rPr>
+        <w:drawing>
+          <wp:inline distT="0" distB="0" distL="0" distR="0" wp14:anchorId="14AC8F44" wp14:editId="23218280">
+            <wp:extent cx="5757862" cy="2442346"/>
+            <wp:effectExtent l="0" t="0" r="0" b="0"/>
+            <wp:docPr id="1730217959" name="Imagen 1"/>
+            <wp:cNvGraphicFramePr>
+              <a:graphicFrameLocks xmlns:a="http://schemas.openxmlformats.org/drawingml/2006/main" noChangeAspect="1"/>
+            </wp:cNvGraphicFramePr>
+            <a:graphic xmlns:a="http://schemas.openxmlformats.org/drawingml/2006/main">
+              <a:graphicData uri="http://schemas.openxmlformats.org/drawingml/2006/picture">
+                <pic:pic xmlns:pic="http://schemas.openxmlformats.org/drawingml/2006/picture">
+                  <pic:nvPicPr>
+                    <pic:cNvPr id="229068319" name=""/>
+                    <pic:cNvPicPr/>
+                  </pic:nvPicPr>
+                  <pic:blipFill rotWithShape="1">
+                    <a:blip r:embed="rId13"/>
+                    <a:srcRect r="22777" b="-977"/>
+                    <a:stretch>
+                      <a:fillRect/>
+                    </a:stretch>
+                  </pic:blipFill>
+                  <pic:spPr bwMode="auto">
+                    <a:xfrm>
+                      <a:off x="0" y="0"/>
+                      <a:ext cx="5764961" cy="2445357"/>
+                    </a:xfrm>
+                    <a:prstGeom prst="rect">
+                      <a:avLst/>
+                    </a:prstGeom>
+                    <a:ln>
+                      <a:noFill/>
+                    </a:ln>
+                    <a:extLst>
+                      <a:ext uri="{53640926-AAD7-44D8-BBD7-CCE9431645EC}">
+                        <a14:shadowObscured xmlns:a14="http://schemas.microsoft.com/office/drawing/2010/main"/>
+                      </a:ext>
+                    </a:extLst>
+                  </pic:spPr>
+                </pic:pic>
+              </a:graphicData>
+            </a:graphic>
+          </wp:inline>
+        </w:drawing>
+      </w:r>
     </w:p>
     <w:p>
       <w:pPr>
@@ -1479,7 +2074,7 @@
           <w:ilvl w:val="0"/>
           <w:numId w:val="15"/>
         </w:numPr>
-        <w:spacing w:after="0"/>
+        <w:spacing w:after="0" w:line="240" w:lineRule="auto"/>
         <w:jc w:val="both"/>
         <w:rPr>
           <w:b/>
@@ -1497,13 +2092,62 @@
     <w:p>
       <w:pPr>
         <w:pStyle w:val="Sinespaciado"/>
-        <w:spacing w:after="0"/>
-        <w:jc w:val="both"/>
-        <w:rPr>
-          <w:b/>
-          <w:bCs w:val="0"/>
-        </w:rPr>
-      </w:pPr>
+        <w:spacing w:after="0" w:line="240" w:lineRule="auto"/>
+        <w:jc w:val="both"/>
+        <w:rPr>
+          <w:b/>
+          <w:bCs w:val="0"/>
+        </w:rPr>
+      </w:pPr>
+      <w:r>
+        <w:rPr>
+          <w:b/>
+        </w:rPr>
+        <w:drawing>
+          <wp:inline distT="0" distB="0" distL="0" distR="0" wp14:anchorId="1DE26936" wp14:editId="7B14A647">
+            <wp:extent cx="5843587" cy="1513305"/>
+            <wp:effectExtent l="0" t="0" r="5080" b="0"/>
+            <wp:docPr id="7335858" name="Imagen 1"/>
+            <wp:cNvGraphicFramePr>
+              <a:graphicFrameLocks xmlns:a="http://schemas.openxmlformats.org/drawingml/2006/main" noChangeAspect="1"/>
+            </wp:cNvGraphicFramePr>
+            <a:graphic xmlns:a="http://schemas.openxmlformats.org/drawingml/2006/main">
+              <a:graphicData uri="http://schemas.openxmlformats.org/drawingml/2006/picture">
+                <pic:pic xmlns:pic="http://schemas.openxmlformats.org/drawingml/2006/picture">
+                  <pic:nvPicPr>
+                    <pic:cNvPr id="2139733534" name=""/>
+                    <pic:cNvPicPr/>
+                  </pic:nvPicPr>
+                  <pic:blipFill rotWithShape="1">
+                    <a:blip r:embed="rId14"/>
+                    <a:srcRect r="24304" b="1114"/>
+                    <a:stretch>
+                      <a:fillRect/>
+                    </a:stretch>
+                  </pic:blipFill>
+                  <pic:spPr bwMode="auto">
+                    <a:xfrm>
+                      <a:off x="0" y="0"/>
+                      <a:ext cx="5860710" cy="1517739"/>
+                    </a:xfrm>
+                    <a:prstGeom prst="rect">
+                      <a:avLst/>
+                    </a:prstGeom>
+                    <a:ln>
+                      <a:noFill/>
+                    </a:ln>
+                    <a:extLst>
+                      <a:ext uri="{53640926-AAD7-44D8-BBD7-CCE9431645EC}">
+                        <a14:shadowObscured xmlns:a14="http://schemas.microsoft.com/office/drawing/2010/main"/>
+                      </a:ext>
+                    </a:extLst>
+                  </pic:spPr>
+                </pic:pic>
+              </a:graphicData>
+            </a:graphic>
+          </wp:inline>
+        </w:drawing>
+      </w:r>
     </w:p>
     <w:p>
       <w:pPr>
@@ -1512,7 +2156,7 @@
           <w:ilvl w:val="0"/>
           <w:numId w:val="15"/>
         </w:numPr>
-        <w:spacing w:after="0"/>
+        <w:spacing w:after="0" w:line="240" w:lineRule="auto"/>
         <w:jc w:val="both"/>
         <w:rPr>
           <w:b/>
@@ -1530,7 +2174,68 @@
     <w:p>
       <w:pPr>
         <w:pStyle w:val="Sinespaciado"/>
-        <w:spacing w:after="0"/>
+        <w:spacing w:after="0" w:line="240" w:lineRule="auto"/>
+        <w:ind w:left="0" w:firstLine="0"/>
+        <w:jc w:val="both"/>
+        <w:rPr>
+          <w:b/>
+          <w:bCs w:val="0"/>
+        </w:rPr>
+      </w:pPr>
+      <w:r>
+        <w:rPr>
+          <w:b/>
+        </w:rPr>
+        <w:drawing>
+          <wp:inline distT="0" distB="0" distL="0" distR="0" wp14:anchorId="12B1994E" wp14:editId="7EDE3383">
+            <wp:extent cx="5600700" cy="1613002"/>
+            <wp:effectExtent l="0" t="0" r="0" b="6350"/>
+            <wp:docPr id="903038797" name="Imagen 1"/>
+            <wp:cNvGraphicFramePr>
+              <a:graphicFrameLocks xmlns:a="http://schemas.openxmlformats.org/drawingml/2006/main" noChangeAspect="1"/>
+            </wp:cNvGraphicFramePr>
+            <a:graphic xmlns:a="http://schemas.openxmlformats.org/drawingml/2006/main">
+              <a:graphicData uri="http://schemas.openxmlformats.org/drawingml/2006/picture">
+                <pic:pic xmlns:pic="http://schemas.openxmlformats.org/drawingml/2006/picture">
+                  <pic:nvPicPr>
+                    <pic:cNvPr id="1828618809" name=""/>
+                    <pic:cNvPicPr/>
+                  </pic:nvPicPr>
+                  <pic:blipFill rotWithShape="1">
+                    <a:blip r:embed="rId15"/>
+                    <a:srcRect r="25747"/>
+                    <a:stretch>
+                      <a:fillRect/>
+                    </a:stretch>
+                  </pic:blipFill>
+                  <pic:spPr bwMode="auto">
+                    <a:xfrm>
+                      <a:off x="0" y="0"/>
+                      <a:ext cx="5613124" cy="1616580"/>
+                    </a:xfrm>
+                    <a:prstGeom prst="rect">
+                      <a:avLst/>
+                    </a:prstGeom>
+                    <a:ln>
+                      <a:noFill/>
+                    </a:ln>
+                    <a:extLst>
+                      <a:ext uri="{53640926-AAD7-44D8-BBD7-CCE9431645EC}">
+                        <a14:shadowObscured xmlns:a14="http://schemas.microsoft.com/office/drawing/2010/main"/>
+                      </a:ext>
+                    </a:extLst>
+                  </pic:spPr>
+                </pic:pic>
+              </a:graphicData>
+            </a:graphic>
+          </wp:inline>
+        </w:drawing>
+      </w:r>
+    </w:p>
+    <w:p>
+      <w:pPr>
+        <w:pStyle w:val="Sinespaciado"/>
+        <w:spacing w:after="0" w:line="240" w:lineRule="auto"/>
         <w:ind w:left="0" w:firstLine="0"/>
         <w:jc w:val="both"/>
         <w:rPr>
@@ -1546,31 +2251,128 @@
           <w:ilvl w:val="0"/>
           <w:numId w:val="15"/>
         </w:numPr>
-        <w:spacing w:after="0"/>
-        <w:jc w:val="both"/>
-        <w:rPr>
-          <w:b/>
-          <w:bCs w:val="0"/>
-        </w:rPr>
-      </w:pPr>
-      <w:r>
-        <w:rPr>
-          <w:b/>
-          <w:bCs w:val="0"/>
-        </w:rPr>
+        <w:spacing w:after="0" w:line="240" w:lineRule="auto"/>
+        <w:jc w:val="both"/>
+        <w:rPr>
+          <w:b/>
+          <w:bCs w:val="0"/>
+        </w:rPr>
+      </w:pPr>
+      <w:r>
+        <w:rPr>
+          <w:b/>
+          <w:bCs w:val="0"/>
+        </w:rPr>
+        <w:lastRenderedPageBreak/>
         <w:t>Cálculo manual de dos subtotales.</w:t>
       </w:r>
     </w:p>
     <w:p>
       <w:pPr>
-        <w:pStyle w:val="Sinespaciado"/>
-        <w:spacing w:after="0"/>
-        <w:ind w:left="0" w:firstLine="0"/>
-        <w:jc w:val="both"/>
-        <w:rPr>
-          <w:b/>
-          <w:bCs w:val="0"/>
-        </w:rPr>
+        <w:spacing w:line="240" w:lineRule="auto"/>
+      </w:pPr>
+      <w:r>
+        <w:t>Producto: Arroz</w:t>
+      </w:r>
+    </w:p>
+    <w:p>
+      <w:pPr>
+        <w:spacing w:line="240" w:lineRule="auto"/>
+      </w:pPr>
+      <w:r>
+        <w:t>Cantidad: 4</w:t>
+      </w:r>
+    </w:p>
+    <w:p>
+      <w:pPr>
+        <w:spacing w:line="240" w:lineRule="auto"/>
+      </w:pPr>
+      <w:r>
+        <w:t>Precio unitario: Q8.50</w:t>
+      </w:r>
+    </w:p>
+    <w:p>
+      <w:pPr>
+        <w:spacing w:line="240" w:lineRule="auto"/>
+      </w:pPr>
+    </w:p>
+    <w:p>
+      <w:pPr>
+        <w:spacing w:line="240" w:lineRule="auto"/>
+      </w:pPr>
+      <w:r>
+        <w:t>Subtotal = cantidad × precio unitario</w:t>
+      </w:r>
+    </w:p>
+    <w:p>
+      <w:pPr>
+        <w:spacing w:line="240" w:lineRule="auto"/>
+      </w:pPr>
+      <w:r>
+        <w:t>Subtotal = 4 × Q8.50</w:t>
+      </w:r>
+    </w:p>
+    <w:p>
+      <w:pPr>
+        <w:spacing w:line="240" w:lineRule="auto"/>
+      </w:pPr>
+      <w:r>
+        <w:t>Subtotal = Q34.00</w:t>
+      </w:r>
+    </w:p>
+    <w:p>
+      <w:pPr>
+        <w:spacing w:line="240" w:lineRule="auto"/>
+      </w:pPr>
+    </w:p>
+    <w:p>
+      <w:pPr>
+        <w:spacing w:line="240" w:lineRule="auto"/>
+      </w:pPr>
+      <w:r>
+        <w:t>Producto: Jugo</w:t>
+      </w:r>
+    </w:p>
+    <w:p>
+      <w:pPr>
+        <w:spacing w:line="240" w:lineRule="auto"/>
+      </w:pPr>
+      <w:r>
+        <w:t>Cantidad: 9</w:t>
+      </w:r>
+    </w:p>
+    <w:p>
+      <w:pPr>
+        <w:spacing w:line="240" w:lineRule="auto"/>
+      </w:pPr>
+      <w:r>
+        <w:t>Precio unitario: Q7.50</w:t>
+      </w:r>
+    </w:p>
+    <w:p>
+      <w:pPr>
+        <w:spacing w:line="240" w:lineRule="auto"/>
+      </w:pPr>
+    </w:p>
+    <w:p>
+      <w:pPr>
+        <w:spacing w:line="240" w:lineRule="auto"/>
+      </w:pPr>
+      <w:r>
+        <w:t>Subtotal = 9 × Q7.50</w:t>
+      </w:r>
+    </w:p>
+    <w:p>
+      <w:pPr>
+        <w:spacing w:line="240" w:lineRule="auto"/>
+      </w:pPr>
+      <w:r>
+        <w:t>Subtotal = Q67.50</w:t>
+      </w:r>
+    </w:p>
+    <w:p>
+      <w:pPr>
+        <w:spacing w:line="240" w:lineRule="auto"/>
       </w:pPr>
     </w:p>
     <w:p>
@@ -1580,7 +2382,7 @@
           <w:ilvl w:val="0"/>
           <w:numId w:val="15"/>
         </w:numPr>
-        <w:spacing w:after="0"/>
+        <w:spacing w:after="0" w:line="240" w:lineRule="auto"/>
         <w:jc w:val="both"/>
         <w:rPr>
           <w:b/>
@@ -1597,37 +2399,194 @@
     </w:p>
     <w:p>
       <w:pPr>
-        <w:pStyle w:val="Sinespaciado"/>
-        <w:spacing w:after="0"/>
-        <w:ind w:left="0" w:firstLine="0"/>
-        <w:jc w:val="both"/>
-        <w:rPr>
-          <w:b/>
-          <w:bCs w:val="0"/>
-        </w:rPr>
-      </w:pPr>
-    </w:p>
-    <w:p>
-      <w:pPr>
-        <w:pStyle w:val="Sinespaciado"/>
-        <w:numPr>
-          <w:ilvl w:val="0"/>
-          <w:numId w:val="15"/>
-        </w:numPr>
-        <w:spacing w:after="0"/>
-        <w:jc w:val="both"/>
-        <w:rPr>
-          <w:b/>
-          <w:bCs w:val="0"/>
-        </w:rPr>
-      </w:pPr>
-      <w:r>
-        <w:rPr>
-          <w:b/>
-          <w:bCs w:val="0"/>
-        </w:rPr>
-        <w:t>Reflexión final.</w:t>
-      </w:r>
+        <w:spacing w:line="240" w:lineRule="auto"/>
+        <w:rPr>
+          <w:lang w:val="fr-FR"/>
+        </w:rPr>
+      </w:pPr>
+      <w:proofErr w:type="gramStart"/>
+      <w:r>
+        <w:rPr>
+          <w:lang w:val="fr-FR"/>
+        </w:rPr>
+        <w:t>Leche:</w:t>
+      </w:r>
+      <w:proofErr w:type="gramEnd"/>
+      <w:r>
+        <w:rPr>
+          <w:lang w:val="fr-FR"/>
+        </w:rPr>
+        <w:t xml:space="preserve">       2 × 12.50 = Q25.00</w:t>
+      </w:r>
+    </w:p>
+    <w:p>
+      <w:pPr>
+        <w:spacing w:line="240" w:lineRule="auto"/>
+        <w:rPr>
+          <w:lang w:val="fr-FR"/>
+        </w:rPr>
+      </w:pPr>
+      <w:proofErr w:type="spellStart"/>
+      <w:proofErr w:type="gramStart"/>
+      <w:r>
+        <w:rPr>
+          <w:lang w:val="fr-FR"/>
+        </w:rPr>
+        <w:t>Yogurt</w:t>
+      </w:r>
+      <w:proofErr w:type="spellEnd"/>
+      <w:r>
+        <w:rPr>
+          <w:lang w:val="fr-FR"/>
+        </w:rPr>
+        <w:t>:</w:t>
+      </w:r>
+      <w:proofErr w:type="gramEnd"/>
+      <w:r>
+        <w:rPr>
+          <w:lang w:val="fr-FR"/>
+        </w:rPr>
+        <w:t xml:space="preserve">      3 × </w:t>
+      </w:r>
+      <w:proofErr w:type="gramStart"/>
+      <w:r>
+        <w:rPr>
+          <w:lang w:val="fr-FR"/>
+        </w:rPr>
+        <w:t>6.00  =</w:t>
+      </w:r>
+      <w:proofErr w:type="gramEnd"/>
+      <w:r>
+        <w:rPr>
+          <w:lang w:val="fr-FR"/>
+        </w:rPr>
+        <w:t xml:space="preserve"> Q18.00</w:t>
+      </w:r>
+    </w:p>
+    <w:p>
+      <w:pPr>
+        <w:spacing w:line="240" w:lineRule="auto"/>
+        <w:rPr>
+          <w:lang w:val="fr-FR"/>
+        </w:rPr>
+      </w:pPr>
+      <w:proofErr w:type="spellStart"/>
+      <w:proofErr w:type="gramStart"/>
+      <w:r>
+        <w:rPr>
+          <w:lang w:val="fr-FR"/>
+        </w:rPr>
+        <w:t>Arroz</w:t>
+      </w:r>
+      <w:proofErr w:type="spellEnd"/>
+      <w:r>
+        <w:rPr>
+          <w:lang w:val="fr-FR"/>
+        </w:rPr>
+        <w:t>:</w:t>
+      </w:r>
+      <w:proofErr w:type="gramEnd"/>
+      <w:r>
+        <w:rPr>
+          <w:lang w:val="fr-FR"/>
+        </w:rPr>
+        <w:t xml:space="preserve">       4 × </w:t>
+      </w:r>
+      <w:proofErr w:type="gramStart"/>
+      <w:r>
+        <w:rPr>
+          <w:lang w:val="fr-FR"/>
+        </w:rPr>
+        <w:t>8.50  =</w:t>
+      </w:r>
+      <w:proofErr w:type="gramEnd"/>
+      <w:r>
+        <w:rPr>
+          <w:lang w:val="fr-FR"/>
+        </w:rPr>
+        <w:t xml:space="preserve"> Q34.00</w:t>
+      </w:r>
+    </w:p>
+    <w:p>
+      <w:pPr>
+        <w:spacing w:line="240" w:lineRule="auto"/>
+      </w:pPr>
+      <w:r>
+        <w:t>Frijol:      5 × 10.00 = Q50.00</w:t>
+      </w:r>
+    </w:p>
+    <w:p>
+      <w:pPr>
+        <w:spacing w:line="240" w:lineRule="auto"/>
+      </w:pPr>
+      <w:r>
+        <w:t>Detergente:  2 × 28.00 = Q56.00</w:t>
+      </w:r>
+    </w:p>
+    <w:p>
+      <w:pPr>
+        <w:spacing w:line="240" w:lineRule="auto"/>
+      </w:pPr>
+      <w:r>
+        <w:t xml:space="preserve">Jugo:        9 × </w:t>
+      </w:r>
+      <w:proofErr w:type="gramStart"/>
+      <w:r>
+        <w:t>7.50  =</w:t>
+      </w:r>
+      <w:proofErr w:type="gramEnd"/>
+      <w:r>
+        <w:t xml:space="preserve"> Q67.50</w:t>
+      </w:r>
+    </w:p>
+    <w:p>
+      <w:pPr>
+        <w:spacing w:line="240" w:lineRule="auto"/>
+      </w:pPr>
+    </w:p>
+    <w:p>
+      <w:pPr>
+        <w:spacing w:line="240" w:lineRule="auto"/>
+      </w:pPr>
+      <w:r>
+        <w:t>Valor total:</w:t>
+      </w:r>
+    </w:p>
+    <w:p>
+      <w:pPr>
+        <w:spacing w:line="240" w:lineRule="auto"/>
+      </w:pPr>
+      <w:r>
+        <w:t>Q25.00 + Q18.00 + Q34.00 + Q50.00 + Q56.00 + Q67.50</w:t>
+      </w:r>
+    </w:p>
+    <w:p>
+      <w:pPr>
+        <w:spacing w:line="240" w:lineRule="auto"/>
+      </w:pPr>
+      <w:r>
+        <w:t>= Q250.50</w:t>
+      </w:r>
+    </w:p>
+    <w:p>
+      <w:pPr>
+        <w:spacing w:line="240" w:lineRule="auto"/>
+      </w:pPr>
+    </w:p>
+    <w:p>
+      <w:pPr>
+        <w:spacing w:line="240" w:lineRule="auto"/>
+      </w:pPr>
+    </w:p>
+    <w:p>
+      <w:pPr>
+        <w:spacing w:line="240" w:lineRule="auto"/>
+      </w:pPr>
+    </w:p>
+    <w:p>
+      <w:pPr>
+        <w:spacing w:line="240" w:lineRule="auto"/>
+      </w:pPr>
     </w:p>
     <w:p>
       <w:pPr>
@@ -1648,6 +2607,7 @@
           <w:sz w:val="28"/>
           <w:szCs w:val="28"/>
         </w:rPr>
+        <w:lastRenderedPageBreak/>
         <w:t>Parte 5. Diseño de la API REST</w:t>
       </w:r>
     </w:p>
@@ -1659,10 +2619,10 @@
         <w:tblLook w:val="04A0" w:firstRow="1" w:lastRow="0" w:firstColumn="1" w:lastColumn="0" w:noHBand="0" w:noVBand="1"/>
       </w:tblPr>
       <w:tblGrid>
-        <w:gridCol w:w="2529"/>
-        <w:gridCol w:w="1085"/>
-        <w:gridCol w:w="3712"/>
-        <w:gridCol w:w="1502"/>
+        <w:gridCol w:w="2671"/>
+        <w:gridCol w:w="1010"/>
+        <w:gridCol w:w="3827"/>
+        <w:gridCol w:w="1320"/>
       </w:tblGrid>
       <w:tr>
         <w:trPr>
@@ -1672,7 +2632,7 @@
         <w:tc>
           <w:tcPr>
             <w:cnfStyle w:val="001000000000" w:firstRow="0" w:lastRow="0" w:firstColumn="1" w:lastColumn="0" w:oddVBand="0" w:evenVBand="0" w:oddHBand="0" w:evenHBand="0" w:firstRowFirstColumn="0" w:firstRowLastColumn="0" w:lastRowFirstColumn="0" w:lastRowLastColumn="0"/>
-            <w:tcW w:w="3114" w:type="dxa"/>
+            <w:tcW w:w="2671" w:type="dxa"/>
             <w:shd w:val="clear" w:color="auto" w:fill="45B0E1" w:themeFill="accent1" w:themeFillTint="99"/>
           </w:tcPr>
           <w:p>
@@ -1689,7 +2649,7 @@
         </w:tc>
         <w:tc>
           <w:tcPr>
-            <w:tcW w:w="1134" w:type="dxa"/>
+            <w:tcW w:w="1010" w:type="dxa"/>
             <w:shd w:val="clear" w:color="auto" w:fill="45B0E1" w:themeFill="accent1" w:themeFillTint="99"/>
           </w:tcPr>
           <w:p>
@@ -1707,7 +2667,7 @@
         </w:tc>
         <w:tc>
           <w:tcPr>
-            <w:tcW w:w="2551" w:type="dxa"/>
+            <w:tcW w:w="3827" w:type="dxa"/>
             <w:shd w:val="clear" w:color="auto" w:fill="45B0E1" w:themeFill="accent1" w:themeFillTint="99"/>
           </w:tcPr>
           <w:p>
@@ -1725,7 +2685,7 @@
         </w:tc>
         <w:tc>
           <w:tcPr>
-            <w:tcW w:w="1843" w:type="dxa"/>
+            <w:tcW w:w="1320" w:type="dxa"/>
             <w:shd w:val="clear" w:color="auto" w:fill="45B0E1" w:themeFill="accent1" w:themeFillTint="99"/>
           </w:tcPr>
           <w:p>
@@ -1746,7 +2706,7 @@
         <w:tc>
           <w:tcPr>
             <w:cnfStyle w:val="001000000000" w:firstRow="0" w:lastRow="0" w:firstColumn="1" w:lastColumn="0" w:oddVBand="0" w:evenVBand="0" w:oddHBand="0" w:evenHBand="0" w:firstRowFirstColumn="0" w:firstRowLastColumn="0" w:lastRowFirstColumn="0" w:lastRowLastColumn="0"/>
-            <w:tcW w:w="3114" w:type="dxa"/>
+            <w:tcW w:w="2671" w:type="dxa"/>
           </w:tcPr>
           <w:p>
             <w:pPr>
@@ -1768,7 +2728,7 @@
         </w:tc>
         <w:tc>
           <w:tcPr>
-            <w:tcW w:w="1134" w:type="dxa"/>
+            <w:tcW w:w="1010" w:type="dxa"/>
           </w:tcPr>
           <w:p>
             <w:pPr>
@@ -1791,7 +2751,7 @@
         </w:tc>
         <w:tc>
           <w:tcPr>
-            <w:tcW w:w="2551" w:type="dxa"/>
+            <w:tcW w:w="3827" w:type="dxa"/>
           </w:tcPr>
           <w:p>
             <w:pPr>
@@ -1820,7 +2780,7 @@
         </w:tc>
         <w:tc>
           <w:tcPr>
-            <w:tcW w:w="1843" w:type="dxa"/>
+            <w:tcW w:w="1320" w:type="dxa"/>
           </w:tcPr>
           <w:p>
             <w:pPr>
@@ -1830,12 +2790,16 @@
               <w:jc w:val="both"/>
               <w:cnfStyle w:val="000000000000" w:firstRow="0" w:lastRow="0" w:firstColumn="0" w:lastColumn="0" w:oddVBand="0" w:evenVBand="0" w:oddHBand="0" w:evenHBand="0" w:firstRowFirstColumn="0" w:firstRowLastColumn="0" w:lastRowFirstColumn="0" w:lastRowLastColumn="0"/>
               <w:rPr>
-                <w:bCs w:val="0"/>
+                <w:b/>
+                <w:sz w:val="22"/>
+                <w:szCs w:val="22"/>
               </w:rPr>
             </w:pPr>
             <w:r>
               <w:rPr>
-                <w:bCs w:val="0"/>
+                <w:b/>
+                <w:sz w:val="22"/>
+                <w:szCs w:val="22"/>
               </w:rPr>
               <w:t xml:space="preserve">200 </w:t>
             </w:r>
@@ -1846,14 +2810,13 @@
         <w:tc>
           <w:tcPr>
             <w:cnfStyle w:val="001000000000" w:firstRow="0" w:lastRow="0" w:firstColumn="1" w:lastColumn="0" w:oddVBand="0" w:evenVBand="0" w:oddHBand="0" w:evenHBand="0" w:firstRowFirstColumn="0" w:firstRowLastColumn="0" w:lastRowFirstColumn="0" w:lastRowLastColumn="0"/>
-            <w:tcW w:w="3114" w:type="dxa"/>
+            <w:tcW w:w="2671" w:type="dxa"/>
           </w:tcPr>
           <w:p>
             <w:pPr>
               <w:pStyle w:val="Sinespaciado"/>
               <w:spacing w:line="360" w:lineRule="auto"/>
               <w:ind w:left="0" w:firstLine="0"/>
-              <w:jc w:val="both"/>
               <w:rPr>
                 <w:bCs/>
               </w:rPr>
@@ -1868,7 +2831,7 @@
         </w:tc>
         <w:tc>
           <w:tcPr>
-            <w:tcW w:w="1134" w:type="dxa"/>
+            <w:tcW w:w="1010" w:type="dxa"/>
           </w:tcPr>
           <w:p>
             <w:pPr>
@@ -1891,7 +2854,7 @@
         </w:tc>
         <w:tc>
           <w:tcPr>
-            <w:tcW w:w="2551" w:type="dxa"/>
+            <w:tcW w:w="3827" w:type="dxa"/>
           </w:tcPr>
           <w:p>
             <w:pPr>
@@ -1920,42 +2883,57 @@
               <w:rPr>
                 <w:bCs w:val="0"/>
               </w:rPr>
-              <w:t xml:space="preserve"> </w:t>
-            </w:r>
-            <w:r>
-              <w:rPr>
-                <w:bCs w:val="0"/>
-              </w:rPr>
               <w:t>/{id}</w:t>
             </w:r>
           </w:p>
         </w:tc>
         <w:tc>
           <w:tcPr>
-            <w:tcW w:w="1843" w:type="dxa"/>
+            <w:tcW w:w="1320" w:type="dxa"/>
           </w:tcPr>
           <w:p>
             <w:pPr>
               <w:pStyle w:val="Sinespaciado"/>
               <w:spacing w:line="360" w:lineRule="auto"/>
               <w:ind w:left="0" w:firstLine="0"/>
-              <w:jc w:val="both"/>
               <w:cnfStyle w:val="000000000000" w:firstRow="0" w:lastRow="0" w:firstColumn="0" w:lastColumn="0" w:oddVBand="0" w:evenVBand="0" w:oddHBand="0" w:evenHBand="0" w:firstRowFirstColumn="0" w:firstRowLastColumn="0" w:lastRowFirstColumn="0" w:lastRowLastColumn="0"/>
               <w:rPr>
-                <w:bCs w:val="0"/>
+                <w:b/>
+                <w:sz w:val="22"/>
+                <w:szCs w:val="22"/>
               </w:rPr>
             </w:pPr>
             <w:r>
               <w:rPr>
-                <w:bCs w:val="0"/>
+                <w:b/>
+                <w:sz w:val="22"/>
+                <w:szCs w:val="22"/>
               </w:rPr>
               <w:t xml:space="preserve">200 </w:t>
             </w:r>
             <w:r>
               <w:rPr>
-                <w:bCs w:val="0"/>
+                <w:b/>
+                <w:sz w:val="22"/>
+                <w:szCs w:val="22"/>
               </w:rPr>
               <w:t>o 404</w:t>
+            </w:r>
+            <w:r>
+              <w:rPr>
+                <w:b/>
+                <w:sz w:val="22"/>
+                <w:szCs w:val="22"/>
+              </w:rPr>
+              <w:t xml:space="preserve"> </w:t>
+            </w:r>
+            <w:r>
+              <w:rPr>
+                <w:b/>
+                <w:sz w:val="22"/>
+                <w:szCs w:val="22"/>
+              </w:rPr>
+              <w:t>Not Found</w:t>
             </w:r>
           </w:p>
         </w:tc>
@@ -1964,7 +2942,7 @@
         <w:tc>
           <w:tcPr>
             <w:cnfStyle w:val="001000000000" w:firstRow="0" w:lastRow="0" w:firstColumn="1" w:lastColumn="0" w:oddVBand="0" w:evenVBand="0" w:oddHBand="0" w:evenHBand="0" w:firstRowFirstColumn="0" w:firstRowLastColumn="0" w:lastRowFirstColumn="0" w:lastRowLastColumn="0"/>
-            <w:tcW w:w="3114" w:type="dxa"/>
+            <w:tcW w:w="2671" w:type="dxa"/>
           </w:tcPr>
           <w:p>
             <w:pPr>
@@ -1986,7 +2964,7 @@
         </w:tc>
         <w:tc>
           <w:tcPr>
-            <w:tcW w:w="1134" w:type="dxa"/>
+            <w:tcW w:w="1010" w:type="dxa"/>
           </w:tcPr>
           <w:p>
             <w:pPr>
@@ -2009,7 +2987,7 @@
         </w:tc>
         <w:tc>
           <w:tcPr>
-            <w:tcW w:w="2551" w:type="dxa"/>
+            <w:tcW w:w="3827" w:type="dxa"/>
           </w:tcPr>
           <w:p>
             <w:pPr>
@@ -2058,7 +3036,7 @@
         </w:tc>
         <w:tc>
           <w:tcPr>
-            <w:tcW w:w="1843" w:type="dxa"/>
+            <w:tcW w:w="1320" w:type="dxa"/>
           </w:tcPr>
           <w:p>
             <w:pPr>
@@ -2068,14 +3046,34 @@
               <w:jc w:val="both"/>
               <w:cnfStyle w:val="000000000000" w:firstRow="0" w:lastRow="0" w:firstColumn="0" w:lastColumn="0" w:oddVBand="0" w:evenVBand="0" w:oddHBand="0" w:evenHBand="0" w:firstRowFirstColumn="0" w:firstRowLastColumn="0" w:lastRowFirstColumn="0" w:lastRowLastColumn="0"/>
               <w:rPr>
-                <w:bCs w:val="0"/>
+                <w:b/>
+                <w:sz w:val="22"/>
+                <w:szCs w:val="22"/>
               </w:rPr>
             </w:pPr>
             <w:r>
               <w:rPr>
-                <w:bCs w:val="0"/>
+                <w:b/>
+                <w:sz w:val="22"/>
+                <w:szCs w:val="22"/>
               </w:rPr>
               <w:t>200</w:t>
+            </w:r>
+            <w:r>
+              <w:rPr>
+                <w:b/>
+                <w:sz w:val="22"/>
+                <w:szCs w:val="22"/>
+              </w:rPr>
+              <w:t xml:space="preserve"> </w:t>
+            </w:r>
+            <w:r>
+              <w:rPr>
+                <w:b/>
+                <w:sz w:val="22"/>
+                <w:szCs w:val="22"/>
+              </w:rPr>
+              <w:t>OK</w:t>
             </w:r>
           </w:p>
         </w:tc>
@@ -2084,7 +3082,7 @@
         <w:tc>
           <w:tcPr>
             <w:cnfStyle w:val="001000000000" w:firstRow="0" w:lastRow="0" w:firstColumn="1" w:lastColumn="0" w:oddVBand="0" w:evenVBand="0" w:oddHBand="0" w:evenHBand="0" w:firstRowFirstColumn="0" w:firstRowLastColumn="0" w:lastRowFirstColumn="0" w:lastRowLastColumn="0"/>
-            <w:tcW w:w="3114" w:type="dxa"/>
+            <w:tcW w:w="2671" w:type="dxa"/>
           </w:tcPr>
           <w:p>
             <w:pPr>
@@ -2106,7 +3104,7 @@
         </w:tc>
         <w:tc>
           <w:tcPr>
-            <w:tcW w:w="1134" w:type="dxa"/>
+            <w:tcW w:w="1010" w:type="dxa"/>
           </w:tcPr>
           <w:p>
             <w:pPr>
@@ -2129,7 +3127,7 @@
         </w:tc>
         <w:tc>
           <w:tcPr>
-            <w:tcW w:w="2551" w:type="dxa"/>
+            <w:tcW w:w="3827" w:type="dxa"/>
           </w:tcPr>
           <w:p>
             <w:pPr>
@@ -2158,7 +3156,7 @@
               <w:rPr>
                 <w:bCs w:val="0"/>
               </w:rPr>
-              <w:t xml:space="preserve"> /</w:t>
+              <w:t>/</w:t>
             </w:r>
             <w:r>
               <w:rPr>
@@ -2170,7 +3168,7 @@
         </w:tc>
         <w:tc>
           <w:tcPr>
-            <w:tcW w:w="1843" w:type="dxa"/>
+            <w:tcW w:w="1320" w:type="dxa"/>
           </w:tcPr>
           <w:p>
             <w:pPr>
@@ -2180,14 +3178,34 @@
               <w:jc w:val="both"/>
               <w:cnfStyle w:val="000000000000" w:firstRow="0" w:lastRow="0" w:firstColumn="0" w:lastColumn="0" w:oddVBand="0" w:evenVBand="0" w:oddHBand="0" w:evenHBand="0" w:firstRowFirstColumn="0" w:firstRowLastColumn="0" w:lastRowFirstColumn="0" w:lastRowLastColumn="0"/>
               <w:rPr>
-                <w:bCs w:val="0"/>
+                <w:b/>
+                <w:sz w:val="22"/>
+                <w:szCs w:val="22"/>
               </w:rPr>
             </w:pPr>
             <w:r>
               <w:rPr>
-                <w:bCs w:val="0"/>
+                <w:b/>
+                <w:sz w:val="22"/>
+                <w:szCs w:val="22"/>
               </w:rPr>
               <w:t>200</w:t>
+            </w:r>
+            <w:r>
+              <w:rPr>
+                <w:b/>
+                <w:sz w:val="22"/>
+                <w:szCs w:val="22"/>
+              </w:rPr>
+              <w:t xml:space="preserve"> </w:t>
+            </w:r>
+            <w:r>
+              <w:rPr>
+                <w:b/>
+                <w:sz w:val="22"/>
+                <w:szCs w:val="22"/>
+              </w:rPr>
+              <w:t>OK</w:t>
             </w:r>
           </w:p>
         </w:tc>
@@ -2196,7 +3214,7 @@
         <w:tc>
           <w:tcPr>
             <w:cnfStyle w:val="001000000000" w:firstRow="0" w:lastRow="0" w:firstColumn="1" w:lastColumn="0" w:oddVBand="0" w:evenVBand="0" w:oddHBand="0" w:evenHBand="0" w:firstRowFirstColumn="0" w:firstRowLastColumn="0" w:lastRowFirstColumn="0" w:lastRowLastColumn="0"/>
-            <w:tcW w:w="3114" w:type="dxa"/>
+            <w:tcW w:w="2671" w:type="dxa"/>
           </w:tcPr>
           <w:p>
             <w:pPr>
@@ -2218,7 +3236,7 @@
         </w:tc>
         <w:tc>
           <w:tcPr>
-            <w:tcW w:w="1134" w:type="dxa"/>
+            <w:tcW w:w="1010" w:type="dxa"/>
           </w:tcPr>
           <w:p>
             <w:pPr>
@@ -2241,7 +3259,7 @@
         </w:tc>
         <w:tc>
           <w:tcPr>
-            <w:tcW w:w="2551" w:type="dxa"/>
+            <w:tcW w:w="3827" w:type="dxa"/>
           </w:tcPr>
           <w:p>
             <w:pPr>
@@ -2270,7 +3288,7 @@
               <w:rPr>
                 <w:bCs w:val="0"/>
               </w:rPr>
-              <w:t xml:space="preserve"> /</w:t>
+              <w:t>/</w:t>
             </w:r>
             <w:r>
               <w:rPr>
@@ -2282,7 +3300,7 @@
         </w:tc>
         <w:tc>
           <w:tcPr>
-            <w:tcW w:w="1843" w:type="dxa"/>
+            <w:tcW w:w="1320" w:type="dxa"/>
           </w:tcPr>
           <w:p>
             <w:pPr>
@@ -2292,14 +3310,34 @@
               <w:jc w:val="both"/>
               <w:cnfStyle w:val="000000000000" w:firstRow="0" w:lastRow="0" w:firstColumn="0" w:lastColumn="0" w:oddVBand="0" w:evenVBand="0" w:oddHBand="0" w:evenHBand="0" w:firstRowFirstColumn="0" w:firstRowLastColumn="0" w:lastRowFirstColumn="0" w:lastRowLastColumn="0"/>
               <w:rPr>
-                <w:bCs w:val="0"/>
+                <w:b/>
+                <w:sz w:val="22"/>
+                <w:szCs w:val="22"/>
               </w:rPr>
             </w:pPr>
             <w:r>
               <w:rPr>
-                <w:bCs w:val="0"/>
+                <w:b/>
+                <w:sz w:val="22"/>
+                <w:szCs w:val="22"/>
               </w:rPr>
               <w:t>200</w:t>
+            </w:r>
+            <w:r>
+              <w:rPr>
+                <w:b/>
+                <w:sz w:val="22"/>
+                <w:szCs w:val="22"/>
+              </w:rPr>
+              <w:t xml:space="preserve"> </w:t>
+            </w:r>
+            <w:r>
+              <w:rPr>
+                <w:b/>
+                <w:sz w:val="22"/>
+                <w:szCs w:val="22"/>
+              </w:rPr>
+              <w:t>OK</w:t>
             </w:r>
           </w:p>
         </w:tc>
@@ -2308,7 +3346,7 @@
         <w:tc>
           <w:tcPr>
             <w:cnfStyle w:val="001000000000" w:firstRow="0" w:lastRow="0" w:firstColumn="1" w:lastColumn="0" w:oddVBand="0" w:evenVBand="0" w:oddHBand="0" w:evenHBand="0" w:firstRowFirstColumn="0" w:firstRowLastColumn="0" w:lastRowFirstColumn="0" w:lastRowLastColumn="0"/>
-            <w:tcW w:w="3114" w:type="dxa"/>
+            <w:tcW w:w="2671" w:type="dxa"/>
           </w:tcPr>
           <w:p>
             <w:pPr>
@@ -2330,7 +3368,7 @@
         </w:tc>
         <w:tc>
           <w:tcPr>
-            <w:tcW w:w="1134" w:type="dxa"/>
+            <w:tcW w:w="1010" w:type="dxa"/>
           </w:tcPr>
           <w:p>
             <w:pPr>
@@ -2353,7 +3391,7 @@
         </w:tc>
         <w:tc>
           <w:tcPr>
-            <w:tcW w:w="2551" w:type="dxa"/>
+            <w:tcW w:w="3827" w:type="dxa"/>
           </w:tcPr>
           <w:p>
             <w:pPr>
@@ -2394,7 +3432,7 @@
         </w:tc>
         <w:tc>
           <w:tcPr>
-            <w:tcW w:w="1843" w:type="dxa"/>
+            <w:tcW w:w="1320" w:type="dxa"/>
           </w:tcPr>
           <w:p>
             <w:pPr>
@@ -2404,14 +3442,34 @@
               <w:jc w:val="both"/>
               <w:cnfStyle w:val="000000000000" w:firstRow="0" w:lastRow="0" w:firstColumn="0" w:lastColumn="0" w:oddVBand="0" w:evenVBand="0" w:oddHBand="0" w:evenHBand="0" w:firstRowFirstColumn="0" w:firstRowLastColumn="0" w:lastRowFirstColumn="0" w:lastRowLastColumn="0"/>
               <w:rPr>
-                <w:bCs w:val="0"/>
+                <w:b/>
+                <w:sz w:val="22"/>
+                <w:szCs w:val="22"/>
               </w:rPr>
             </w:pPr>
             <w:r>
               <w:rPr>
-                <w:bCs w:val="0"/>
+                <w:b/>
+                <w:sz w:val="22"/>
+                <w:szCs w:val="22"/>
               </w:rPr>
               <w:t>200</w:t>
+            </w:r>
+            <w:r>
+              <w:rPr>
+                <w:b/>
+                <w:sz w:val="22"/>
+                <w:szCs w:val="22"/>
+              </w:rPr>
+              <w:t xml:space="preserve"> </w:t>
+            </w:r>
+            <w:r>
+              <w:rPr>
+                <w:b/>
+                <w:sz w:val="22"/>
+                <w:szCs w:val="22"/>
+              </w:rPr>
+              <w:t>OK</w:t>
             </w:r>
           </w:p>
         </w:tc>
@@ -2432,19 +3490,7 @@
       <w:pPr>
         <w:pStyle w:val="Sinespaciado"/>
         <w:spacing w:after="0"/>
-        <w:jc w:val="both"/>
-        <w:rPr>
-          <w:b/>
-          <w:bCs w:val="0"/>
-          <w:sz w:val="28"/>
-          <w:szCs w:val="28"/>
-        </w:rPr>
-      </w:pPr>
-    </w:p>
-    <w:p>
-      <w:pPr>
-        <w:pStyle w:val="Sinespaciado"/>
-        <w:spacing w:after="0"/>
+        <w:ind w:left="0" w:firstLine="0"/>
         <w:jc w:val="both"/>
         <w:rPr>
           <w:b/>
@@ -2503,7 +3549,6 @@
         <w:rPr>
           <w:b/>
         </w:rPr>
-        <w:lastRenderedPageBreak/>
         <w:t>¿Qué función cumple @RestController?</w:t>
       </w:r>
     </w:p>
@@ -2700,6 +3745,15 @@
     </w:p>
     <w:p>
       <w:pPr>
+        <w:spacing w:line="276" w:lineRule="auto"/>
+        <w:jc w:val="both"/>
+        <w:rPr>
+          <w:color w:val="EE0000"/>
+        </w:rPr>
+      </w:pPr>
+    </w:p>
+    <w:p>
+      <w:pPr>
         <w:pStyle w:val="Sinespaciado"/>
         <w:numPr>
           <w:ilvl w:val="0"/>
@@ -2715,6 +3769,7 @@
         <w:rPr>
           <w:b/>
         </w:rPr>
+        <w:lastRenderedPageBreak/>
         <w:t>¿Qué lógica utilizó para determinar el producto de mayor valor?</w:t>
       </w:r>
     </w:p>
@@ -2870,9 +3925,9 @@
       </w:pPr>
     </w:p>
     <w:sectPr>
-      <w:headerReference w:type="even" r:id="rId16"/>
-      <w:headerReference w:type="default" r:id="rId17"/>
-      <w:headerReference w:type="first" r:id="rId18"/>
+      <w:headerReference w:type="even" r:id="rId23"/>
+      <w:headerReference w:type="default" r:id="rId24"/>
+      <w:headerReference w:type="first" r:id="rId25"/>
       <w:pgSz w:w="12240" w:h="15840"/>
       <w:pgMar w:top="1417" w:right="1701" w:bottom="1417" w:left="1701" w:header="708" w:footer="708" w:gutter="0"/>
       <w:cols w:space="708"/>

</xml_diff>